<commit_message>
Clean Distributed Database documentation
</commit_message>
<xml_diff>
--- a/docs/Report/Distributed Database Design.docx
+++ b/docs/Report/Distributed Database Design.docx
@@ -1,38 +1,334 @@
 
 <file path=word/document.xml><?xml version="1.0" encoding="utf-8"?>
-<w:document xmlns:wpc="http://schemas.microsoft.com/office/word/2010/wordprocessingCanvas" xmlns:cx="http://schemas.microsoft.com/office/drawing/2014/chartex" xmlns:cx1="http://schemas.microsoft.com/office/drawing/2015/9/8/chartex" xmlns:cx2="http://schemas.microsoft.com/office/drawing/2015/10/21/chartex" xmlns:cx3="http://schemas.microsoft.com/office/drawing/2016/5/9/chartex" xmlns:cx4="http://schemas.microsoft.com/office/drawing/2016/5/10/chartex" xmlns:cx5="http://schemas.microsoft.com/office/drawing/2016/5/11/chartex" xmlns:cx6="http://schemas.microsoft.com/office/drawing/2016/5/12/chartex" xmlns:cx7="http://schemas.microsoft.com/office/drawing/2016/5/13/chartex" xmlns:cx8="http://schemas.microsoft.com/office/drawing/2016/5/14/chartex" xmlns:mc="http://schemas.openxmlformats.org/markup-compatibility/2006" xmlns:aink="http://schemas.microsoft.com/office/drawing/2016/ink" xmlns:am3d="http://schemas.microsoft.com/office/drawing/2017/model3d" xmlns:o="urn:schemas-microsoft-com:office:office" xmlns:r="http://schemas.openxmlformats.org/officeDocument/2006/relationships" xmlns:m="http://schemas.openxmlformats.org/officeDocument/2006/math" xmlns:v="urn:schemas-microsoft-com:vml" xmlns:wp14="http://schemas.microsoft.com/office/word/2010/wordprocessingDrawing" xmlns:wp="http://schemas.openxmlformats.org/drawingml/2006/wordprocessingDrawing" xmlns:w10="urn:schemas-microsoft-com:office:word" xmlns:w="http://schemas.openxmlformats.org/wordprocessingml/2006/main" xmlns:w14="http://schemas.microsoft.com/office/word/2010/wordml" xmlns:w15="http://schemas.microsoft.com/office/word/2012/wordml" xmlns:w16cex="http://schemas.microsoft.com/office/word/2018/wordml/cex" xmlns:w16cid="http://schemas.microsoft.com/office/word/2016/wordml/cid" xmlns:w16="http://schemas.microsoft.com/office/word/2018/wordml" xmlns:w16sdtdh="http://schemas.microsoft.com/office/word/2020/wordml/sdtdatahash" xmlns:w16se="http://schemas.microsoft.com/office/word/2015/wordml/symex" xmlns:wpg="http://schemas.microsoft.com/office/word/2010/wordprocessingGroup" xmlns:wpi="http://schemas.microsoft.com/office/word/2010/wordprocessingInk" xmlns:wne="http://schemas.microsoft.com/office/word/2006/wordml" xmlns:wps="http://schemas.microsoft.com/office/word/2010/wordprocessingShape" mc:Ignorable="w14 w15 w16se w16cid w16 w16cex w16sdtdh wp14">
+<w:document xmlns:wpc="http://schemas.microsoft.com/office/word/2010/wordprocessingCanvas" xmlns:cx="http://schemas.microsoft.com/office/drawing/2014/chartex" xmlns:cx1="http://schemas.microsoft.com/office/drawing/2015/9/8/chartex" xmlns:cx2="http://schemas.microsoft.com/office/drawing/2015/10/21/chartex" xmlns:cx3="http://schemas.microsoft.com/office/drawing/2016/5/9/chartex" xmlns:cx4="http://schemas.microsoft.com/office/drawing/2016/5/10/chartex" xmlns:cx5="http://schemas.microsoft.com/office/drawing/2016/5/11/chartex" xmlns:cx6="http://schemas.microsoft.com/office/drawing/2016/5/12/chartex" xmlns:cx7="http://schemas.microsoft.com/office/drawing/2016/5/13/chartex" xmlns:cx8="http://schemas.microsoft.com/office/drawing/2016/5/14/chartex" xmlns:mc="http://schemas.openxmlformats.org/markup-compatibility/2006" xmlns:aink="http://schemas.microsoft.com/office/drawing/2016/ink" xmlns:am3d="http://schemas.microsoft.com/office/drawing/2017/model3d" xmlns:o="urn:schemas-microsoft-com:office:office" xmlns:oel="http://schemas.microsoft.com/office/2019/extlst" xmlns:r="http://schemas.openxmlformats.org/officeDocument/2006/relationships" xmlns:m="http://schemas.openxmlformats.org/officeDocument/2006/math" xmlns:v="urn:schemas-microsoft-com:vml" xmlns:wp14="http://schemas.microsoft.com/office/word/2010/wordprocessingDrawing" xmlns:wp="http://schemas.openxmlformats.org/drawingml/2006/wordprocessingDrawing" xmlns:w10="urn:schemas-microsoft-com:office:word" xmlns:w="http://schemas.openxmlformats.org/wordprocessingml/2006/main" xmlns:w14="http://schemas.microsoft.com/office/word/2010/wordml" xmlns:w15="http://schemas.microsoft.com/office/word/2012/wordml" xmlns:w16cex="http://schemas.microsoft.com/office/word/2018/wordml/cex" xmlns:w16cid="http://schemas.microsoft.com/office/word/2016/wordml/cid" xmlns:w16="http://schemas.microsoft.com/office/word/2018/wordml" xmlns:w16du="http://schemas.microsoft.com/office/word/2023/wordml/word16du" xmlns:w16sdtdh="http://schemas.microsoft.com/office/word/2020/wordml/sdtdatahash" xmlns:w16se="http://schemas.microsoft.com/office/word/2015/wordml/symex" xmlns:wpg="http://schemas.microsoft.com/office/word/2010/wordprocessingGroup" xmlns:wpi="http://schemas.microsoft.com/office/word/2010/wordprocessingInk" xmlns:wne="http://schemas.microsoft.com/office/word/2006/wordml" xmlns:wps="http://schemas.microsoft.com/office/word/2010/wordprocessingShape" mc:Ignorable="w14 w15 w16se w16cid w16 w16cex w16sdtdh wp14">
   <w:body>
     <w:p>
       <w:pPr>
-        <w:jc w:val="center"/>
+        <w:pStyle w:val="Heading1"/>
+      </w:pPr>
+      <w:r>
+        <w:t xml:space="preserve">8. </w:t>
+      </w:r>
+      <w:r>
+        <w:t>Distributed Database Design</w:t>
+      </w:r>
+    </w:p>
+    <w:p>
+      <w:pPr>
+        <w:pStyle w:val="Heading2"/>
+      </w:pPr>
+      <w:r>
+        <w:t>Cockroach</w:t>
+      </w:r>
+      <w:r>
+        <w:t>DB</w:t>
+      </w:r>
+    </w:p>
+    <w:p>
+      <w:pPr>
+        <w:ind w:firstLine="720"/>
+      </w:pPr>
+      <w:r>
+        <w:t>CockroachDB is a</w:t>
+      </w:r>
+      <w:r>
+        <w:t xml:space="preserve"> distributed SQL database </w:t>
+      </w:r>
+      <w:r>
+        <w:t>that is d</w:t>
+      </w:r>
+      <w:r>
+        <w:t>esigned for cloud applications</w:t>
+      </w:r>
+      <w:r>
+        <w:t>. It w</w:t>
+      </w:r>
+      <w:r>
+        <w:t>orks like traditional SQL (PostgreSQL-style) but scales horizontally</w:t>
+      </w:r>
+      <w:r>
+        <w:t>.</w:t>
+      </w:r>
+    </w:p>
+    <w:p>
+      <w:pPr>
+        <w:rPr>
+          <w:sz w:val="24"/>
+          <w:szCs w:val="24"/>
+        </w:rPr>
+      </w:pPr>
+      <w:r>
         <w:rPr>
           <w:b/>
           <w:bCs/>
-          <w:sz w:val="32"/>
-          <w:szCs w:val="32"/>
-          <w:u w:val="single"/>
+          <w:sz w:val="24"/>
+          <w:szCs w:val="24"/>
         </w:rPr>
+        <w:t>Key Benefits</w:t>
+      </w:r>
+    </w:p>
+    <w:p>
+      <w:r>
+        <w:t>1. Horizontal Scalability</w:t>
+      </w:r>
+    </w:p>
+    <w:p>
+      <w:pPr>
+        <w:numPr>
+          <w:ilvl w:val="0"/>
+          <w:numId w:val="3"/>
+        </w:numPr>
+      </w:pPr>
+      <w:r>
+        <w:t xml:space="preserve"> Easily scale by adding more nodes</w:t>
+      </w:r>
+      <w:r>
+        <w:t>.</w:t>
+      </w:r>
+      <w:r>
+        <w:t xml:space="preserve"> </w:t>
+      </w:r>
+    </w:p>
+    <w:p>
+      <w:pPr>
+        <w:numPr>
+          <w:ilvl w:val="0"/>
+          <w:numId w:val="3"/>
+        </w:numPr>
+      </w:pPr>
+      <w:r>
+        <w:t xml:space="preserve"> No need to upgrade a single powerful server</w:t>
+      </w:r>
+      <w:r>
+        <w:t>.</w:t>
+      </w:r>
+    </w:p>
+    <w:p>
+      <w:pPr>
+        <w:numPr>
+          <w:ilvl w:val="0"/>
+          <w:numId w:val="3"/>
+        </w:numPr>
+      </w:pPr>
+      <w:r>
+        <w:t xml:space="preserve"> Handles large-scale systems smoothly</w:t>
+      </w:r>
+      <w:r>
+        <w:t>.</w:t>
+      </w:r>
+    </w:p>
+    <w:p>
+      <w:r>
+        <w:t>2. High Availability</w:t>
+      </w:r>
+    </w:p>
+    <w:p>
+      <w:pPr>
+        <w:numPr>
+          <w:ilvl w:val="0"/>
+          <w:numId w:val="4"/>
+        </w:numPr>
+      </w:pPr>
+      <w:r>
+        <w:t xml:space="preserve"> Data is automatically replicated across multiple nodes</w:t>
+      </w:r>
+      <w:r>
+        <w:t>.</w:t>
+      </w:r>
+      <w:r>
+        <w:t xml:space="preserve"> </w:t>
+      </w:r>
+    </w:p>
+    <w:p>
+      <w:pPr>
+        <w:numPr>
+          <w:ilvl w:val="0"/>
+          <w:numId w:val="4"/>
+        </w:numPr>
+      </w:pPr>
+      <w:r>
+        <w:t xml:space="preserve"> If one node fails, system keeps running</w:t>
+      </w:r>
+      <w:r>
+        <w:t>.</w:t>
+      </w:r>
+      <w:r>
+        <w:t xml:space="preserve"> </w:t>
+      </w:r>
+    </w:p>
+    <w:p>
+      <w:pPr>
+        <w:numPr>
+          <w:ilvl w:val="0"/>
+          <w:numId w:val="4"/>
+        </w:numPr>
+      </w:pPr>
+      <w:r>
+        <w:t xml:space="preserve"> Built-in fault tolerance</w:t>
+      </w:r>
+      <w:r>
+        <w:t>.</w:t>
+      </w:r>
+    </w:p>
+    <w:p>
+      <w:r>
+        <w:t>3. Distributed Architecture</w:t>
+      </w:r>
+    </w:p>
+    <w:p>
+      <w:pPr>
+        <w:numPr>
+          <w:ilvl w:val="0"/>
+          <w:numId w:val="5"/>
+        </w:numPr>
+      </w:pPr>
+      <w:r>
+        <w:t xml:space="preserve"> Data is spread across different machines/regions</w:t>
+      </w:r>
+      <w:r>
+        <w:t>.</w:t>
+      </w:r>
+      <w:r>
+        <w:t xml:space="preserve"> </w:t>
+      </w:r>
+    </w:p>
+    <w:p>
+      <w:pPr>
+        <w:numPr>
+          <w:ilvl w:val="0"/>
+          <w:numId w:val="5"/>
+        </w:numPr>
+      </w:pPr>
+      <w:r>
+        <w:t xml:space="preserve"> Enables global applications with low latency</w:t>
+      </w:r>
+      <w:r>
+        <w:t>.</w:t>
+      </w:r>
+    </w:p>
+    <w:p>
+      <w:r>
+        <w:t>4. Fault Tolerance &amp; Self-Healing</w:t>
+      </w:r>
+    </w:p>
+    <w:p>
+      <w:pPr>
+        <w:numPr>
+          <w:ilvl w:val="0"/>
+          <w:numId w:val="6"/>
+        </w:numPr>
+      </w:pPr>
+      <w:r>
+        <w:t xml:space="preserve"> Automatically recovers from failures</w:t>
+      </w:r>
+      <w:r>
+        <w:t>.</w:t>
+      </w:r>
+    </w:p>
+    <w:p>
+      <w:pPr>
+        <w:numPr>
+          <w:ilvl w:val="0"/>
+          <w:numId w:val="6"/>
+        </w:numPr>
+      </w:pPr>
+      <w:r>
+        <w:t xml:space="preserve"> Rebalances data without manual intervention</w:t>
+      </w:r>
+      <w:r>
+        <w:t>.</w:t>
+      </w:r>
+    </w:p>
+    <w:p>
+      <w:r>
+        <w:t>5. SQL Support (Easy to Learn)</w:t>
+      </w:r>
+    </w:p>
+    <w:p>
+      <w:pPr>
+        <w:numPr>
+          <w:ilvl w:val="0"/>
+          <w:numId w:val="7"/>
+        </w:numPr>
+      </w:pPr>
+      <w:r>
+        <w:t xml:space="preserve"> Uses familiar SQL (</w:t>
+      </w:r>
+      <w:r>
+        <w:t>like</w:t>
+      </w:r>
+      <w:r>
+        <w:t xml:space="preserve"> PostgreSQL) </w:t>
+      </w:r>
+    </w:p>
+    <w:p>
+      <w:pPr>
+        <w:numPr>
+          <w:ilvl w:val="0"/>
+          <w:numId w:val="7"/>
+        </w:numPr>
+      </w:pPr>
+      <w:r>
+        <w:t xml:space="preserve"> Easy for developers to adopt</w:t>
+      </w:r>
+      <w:r>
+        <w:t>.</w:t>
+      </w:r>
+    </w:p>
+    <w:p>
+      <w:r>
+        <w:t>6. Geo-Distribution</w:t>
+      </w:r>
+    </w:p>
+    <w:p>
+      <w:pPr>
+        <w:numPr>
+          <w:ilvl w:val="0"/>
+          <w:numId w:val="8"/>
+        </w:numPr>
+      </w:pPr>
+      <w:r>
+        <w:t xml:space="preserve"> Store data closer to users worldwide</w:t>
+      </w:r>
+      <w:r>
+        <w:t>.</w:t>
+      </w:r>
+    </w:p>
+    <w:p>
+      <w:pPr>
+        <w:numPr>
+          <w:ilvl w:val="0"/>
+          <w:numId w:val="8"/>
+        </w:numPr>
+      </w:pPr>
+      <w:r>
+        <w:t xml:space="preserve"> Improves performance and user experience</w:t>
+      </w:r>
+      <w:r>
+        <w:t>.</w:t>
+      </w:r>
+    </w:p>
+    <w:p>
+      <w:pPr>
+        <w:pStyle w:val="Heading2"/>
+      </w:pPr>
+      <w:r>
+        <w:lastRenderedPageBreak/>
+        <w:t>Schema</w:t>
+      </w:r>
+    </w:p>
+    <w:p>
+      <w:pPr>
+        <w:jc w:val="center"/>
       </w:pPr>
       <w:r>
         <w:rPr>
-          <w:b/>
-          <w:bCs/>
-          <w:sz w:val="32"/>
-          <w:szCs w:val="32"/>
-          <w:u w:val="single"/>
+          <w:noProof/>
         </w:rPr>
-        <w:t>Database Schema for marketplace</w:t>
-      </w:r>
-    </w:p>
-    <w:p>
-      <w:pPr>
-        <w:jc w:val="center"/>
-      </w:pPr>
-      <w:r>
         <w:drawing>
-          <wp:inline distT="0" distB="0" distL="0" distR="0" wp14:anchorId="7963A571" wp14:editId="74074727">
+          <wp:inline distT="0" distB="0" distL="0" distR="0" wp14:anchorId="7963A571" wp14:editId="30099FDF">
             <wp:extent cx="5943600" cy="3606165"/>
-            <wp:effectExtent l="0" t="0" r="0" b="0"/>
+            <wp:effectExtent l="152400" t="152400" r="361950" b="356235"/>
             <wp:docPr id="1" name="Picture 1"/>
             <wp:cNvGraphicFramePr>
               <a:graphicFrameLocks xmlns:a="http://schemas.openxmlformats.org/drawingml/2006/main" noChangeAspect="1"/>
@@ -58,6 +354,16 @@
                     <a:prstGeom prst="rect">
                       <a:avLst/>
                     </a:prstGeom>
+                    <a:ln>
+                      <a:noFill/>
+                    </a:ln>
+                    <a:effectLst>
+                      <a:outerShdw blurRad="292100" dist="139700" dir="2700000" algn="tl" rotWithShape="0">
+                        <a:srgbClr val="333333">
+                          <a:alpha val="65000"/>
+                        </a:srgbClr>
+                      </a:outerShdw>
+                    </a:effectLst>
                   </pic:spPr>
                 </pic:pic>
               </a:graphicData>
@@ -66,793 +372,26 @@
         </w:drawing>
       </w:r>
     </w:p>
-    <w:p/>
+    <w:p>
+      <w:pPr>
+        <w:pStyle w:val="Heading2"/>
+      </w:pPr>
+      <w:r>
+        <w:t>Partitioning Diagram</w:t>
+      </w:r>
+    </w:p>
     <w:p>
       <w:pPr>
         <w:jc w:val="center"/>
+      </w:pPr>
+      <w:r>
         <w:rPr>
-          <w:b/>
-          <w:bCs/>
-          <w:sz w:val="32"/>
-          <w:szCs w:val="32"/>
-          <w:u w:val="single"/>
+          <w:noProof/>
         </w:rPr>
-      </w:pPr>
-      <w:r>
-        <w:rPr>
-          <w:b/>
-          <w:bCs/>
-          <w:sz w:val="32"/>
-          <w:szCs w:val="32"/>
-          <w:u w:val="single"/>
-        </w:rPr>
-        <w:t xml:space="preserve">SQL </w:t>
-      </w:r>
-      <w:r>
-        <w:rPr>
-          <w:b/>
-          <w:bCs/>
-          <w:sz w:val="32"/>
-          <w:szCs w:val="32"/>
-          <w:u w:val="single"/>
-        </w:rPr>
-        <w:t>code</w:t>
-      </w:r>
-      <w:r>
-        <w:rPr>
-          <w:b/>
-          <w:bCs/>
-          <w:sz w:val="32"/>
-          <w:szCs w:val="32"/>
-          <w:u w:val="single"/>
-        </w:rPr>
-        <w:t xml:space="preserve"> for database</w:t>
-      </w:r>
-    </w:p>
-    <w:p>
-      <w:pPr>
-        <w:jc w:val="center"/>
-      </w:pPr>
-      <w:r>
         <w:drawing>
-          <wp:inline distT="0" distB="0" distL="0" distR="0" wp14:anchorId="3FFA699A" wp14:editId="6A873FE4">
-            <wp:extent cx="3175000" cy="1601998"/>
-            <wp:effectExtent l="0" t="0" r="6350" b="0"/>
-            <wp:docPr id="4" name="Picture 3">
-              <a:extLst xmlns:a="http://schemas.openxmlformats.org/drawingml/2006/main">
-                <a:ext uri="{FF2B5EF4-FFF2-40B4-BE49-F238E27FC236}">
-                  <a16:creationId xmlns:a16="http://schemas.microsoft.com/office/drawing/2014/main" id="{690EA16B-7A23-4B74-B7FD-88093A23B323}"/>
-                </a:ext>
-              </a:extLst>
-            </wp:docPr>
-            <wp:cNvGraphicFramePr>
-              <a:graphicFrameLocks xmlns:a="http://schemas.openxmlformats.org/drawingml/2006/main" noChangeAspect="1"/>
-            </wp:cNvGraphicFramePr>
-            <a:graphic xmlns:a="http://schemas.openxmlformats.org/drawingml/2006/main">
-              <a:graphicData uri="http://schemas.openxmlformats.org/drawingml/2006/picture">
-                <pic:pic xmlns:pic="http://schemas.openxmlformats.org/drawingml/2006/picture">
-                  <pic:nvPicPr>
-                    <pic:cNvPr id="4" name="Picture 3">
-                      <a:extLst>
-                        <a:ext uri="{FF2B5EF4-FFF2-40B4-BE49-F238E27FC236}">
-                          <a16:creationId xmlns:a16="http://schemas.microsoft.com/office/drawing/2014/main" id="{690EA16B-7A23-4B74-B7FD-88093A23B323}"/>
-                        </a:ext>
-                      </a:extLst>
-                    </pic:cNvPr>
-                    <pic:cNvPicPr>
-                      <a:picLocks noChangeAspect="1"/>
-                    </pic:cNvPicPr>
-                  </pic:nvPicPr>
-                  <pic:blipFill>
-                    <a:blip r:embed="rId7"/>
-                    <a:stretch>
-                      <a:fillRect/>
-                    </a:stretch>
-                  </pic:blipFill>
-                  <pic:spPr>
-                    <a:xfrm>
-                      <a:off x="0" y="0"/>
-                      <a:ext cx="3201796" cy="1615518"/>
-                    </a:xfrm>
-                    <a:prstGeom prst="rect">
-                      <a:avLst/>
-                    </a:prstGeom>
-                  </pic:spPr>
-                </pic:pic>
-              </a:graphicData>
-            </a:graphic>
-          </wp:inline>
-        </w:drawing>
-      </w:r>
-      <w:r>
-        <w:drawing>
-          <wp:inline distT="0" distB="0" distL="0" distR="0" wp14:anchorId="6ACECF02" wp14:editId="1AE8646F">
-            <wp:extent cx="3276600" cy="1600451"/>
-            <wp:effectExtent l="0" t="0" r="0" b="0"/>
-            <wp:docPr id="8" name="Picture 7">
-              <a:extLst xmlns:a="http://schemas.openxmlformats.org/drawingml/2006/main">
-                <a:ext uri="{FF2B5EF4-FFF2-40B4-BE49-F238E27FC236}">
-                  <a16:creationId xmlns:a16="http://schemas.microsoft.com/office/drawing/2014/main" id="{5521479F-E9D0-480B-B908-79E1B4ADDBAB}"/>
-                </a:ext>
-              </a:extLst>
-            </wp:docPr>
-            <wp:cNvGraphicFramePr>
-              <a:graphicFrameLocks xmlns:a="http://schemas.openxmlformats.org/drawingml/2006/main" noChangeAspect="1"/>
-            </wp:cNvGraphicFramePr>
-            <a:graphic xmlns:a="http://schemas.openxmlformats.org/drawingml/2006/main">
-              <a:graphicData uri="http://schemas.openxmlformats.org/drawingml/2006/picture">
-                <pic:pic xmlns:pic="http://schemas.openxmlformats.org/drawingml/2006/picture">
-                  <pic:nvPicPr>
-                    <pic:cNvPr id="8" name="Picture 7">
-                      <a:extLst>
-                        <a:ext uri="{FF2B5EF4-FFF2-40B4-BE49-F238E27FC236}">
-                          <a16:creationId xmlns:a16="http://schemas.microsoft.com/office/drawing/2014/main" id="{5521479F-E9D0-480B-B908-79E1B4ADDBAB}"/>
-                        </a:ext>
-                      </a:extLst>
-                    </pic:cNvPr>
-                    <pic:cNvPicPr>
-                      <a:picLocks noChangeAspect="1"/>
-                    </pic:cNvPicPr>
-                  </pic:nvPicPr>
-                  <pic:blipFill>
-                    <a:blip r:embed="rId8"/>
-                    <a:stretch>
-                      <a:fillRect/>
-                    </a:stretch>
-                  </pic:blipFill>
-                  <pic:spPr>
-                    <a:xfrm>
-                      <a:off x="0" y="0"/>
-                      <a:ext cx="3292377" cy="1608157"/>
-                    </a:xfrm>
-                    <a:prstGeom prst="rect">
-                      <a:avLst/>
-                    </a:prstGeom>
-                  </pic:spPr>
-                </pic:pic>
-              </a:graphicData>
-            </a:graphic>
-          </wp:inline>
-        </w:drawing>
-      </w:r>
-      <w:r>
-        <w:drawing>
-          <wp:inline distT="0" distB="0" distL="0" distR="0" wp14:anchorId="28C6A44F" wp14:editId="679A4429">
-            <wp:extent cx="3194050" cy="1555090"/>
-            <wp:effectExtent l="0" t="0" r="6350" b="7620"/>
-            <wp:docPr id="6" name="Picture 5">
-              <a:extLst xmlns:a="http://schemas.openxmlformats.org/drawingml/2006/main">
-                <a:ext uri="{FF2B5EF4-FFF2-40B4-BE49-F238E27FC236}">
-                  <a16:creationId xmlns:a16="http://schemas.microsoft.com/office/drawing/2014/main" id="{5E187170-2617-4139-89F5-40AB441C9A65}"/>
-                </a:ext>
-              </a:extLst>
-            </wp:docPr>
-            <wp:cNvGraphicFramePr>
-              <a:graphicFrameLocks xmlns:a="http://schemas.openxmlformats.org/drawingml/2006/main" noChangeAspect="1"/>
-            </wp:cNvGraphicFramePr>
-            <a:graphic xmlns:a="http://schemas.openxmlformats.org/drawingml/2006/main">
-              <a:graphicData uri="http://schemas.openxmlformats.org/drawingml/2006/picture">
-                <pic:pic xmlns:pic="http://schemas.openxmlformats.org/drawingml/2006/picture">
-                  <pic:nvPicPr>
-                    <pic:cNvPr id="6" name="Picture 5">
-                      <a:extLst>
-                        <a:ext uri="{FF2B5EF4-FFF2-40B4-BE49-F238E27FC236}">
-                          <a16:creationId xmlns:a16="http://schemas.microsoft.com/office/drawing/2014/main" id="{5E187170-2617-4139-89F5-40AB441C9A65}"/>
-                        </a:ext>
-                      </a:extLst>
-                    </pic:cNvPr>
-                    <pic:cNvPicPr>
-                      <a:picLocks noChangeAspect="1"/>
-                    </pic:cNvPicPr>
-                  </pic:nvPicPr>
-                  <pic:blipFill>
-                    <a:blip r:embed="rId9"/>
-                    <a:stretch>
-                      <a:fillRect/>
-                    </a:stretch>
-                  </pic:blipFill>
-                  <pic:spPr>
-                    <a:xfrm>
-                      <a:off x="0" y="0"/>
-                      <a:ext cx="3205051" cy="1560446"/>
-                    </a:xfrm>
-                    <a:prstGeom prst="rect">
-                      <a:avLst/>
-                    </a:prstGeom>
-                  </pic:spPr>
-                </pic:pic>
-              </a:graphicData>
-            </a:graphic>
-          </wp:inline>
-        </w:drawing>
-      </w:r>
-      <w:r>
-        <w:drawing>
-          <wp:inline distT="0" distB="0" distL="0" distR="0" wp14:anchorId="439D37E6" wp14:editId="755A3373">
-            <wp:extent cx="2959100" cy="2129604"/>
-            <wp:effectExtent l="0" t="0" r="0" b="4445"/>
-            <wp:docPr id="10" name="Picture 9">
-              <a:extLst xmlns:a="http://schemas.openxmlformats.org/drawingml/2006/main">
-                <a:ext uri="{FF2B5EF4-FFF2-40B4-BE49-F238E27FC236}">
-                  <a16:creationId xmlns:a16="http://schemas.microsoft.com/office/drawing/2014/main" id="{F3A6C020-3A75-443A-BE08-DF62ABFB09AB}"/>
-                </a:ext>
-              </a:extLst>
-            </wp:docPr>
-            <wp:cNvGraphicFramePr>
-              <a:graphicFrameLocks xmlns:a="http://schemas.openxmlformats.org/drawingml/2006/main" noChangeAspect="1"/>
-            </wp:cNvGraphicFramePr>
-            <a:graphic xmlns:a="http://schemas.openxmlformats.org/drawingml/2006/main">
-              <a:graphicData uri="http://schemas.openxmlformats.org/drawingml/2006/picture">
-                <pic:pic xmlns:pic="http://schemas.openxmlformats.org/drawingml/2006/picture">
-                  <pic:nvPicPr>
-                    <pic:cNvPr id="10" name="Picture 9">
-                      <a:extLst>
-                        <a:ext uri="{FF2B5EF4-FFF2-40B4-BE49-F238E27FC236}">
-                          <a16:creationId xmlns:a16="http://schemas.microsoft.com/office/drawing/2014/main" id="{F3A6C020-3A75-443A-BE08-DF62ABFB09AB}"/>
-                        </a:ext>
-                      </a:extLst>
-                    </pic:cNvPr>
-                    <pic:cNvPicPr>
-                      <a:picLocks noChangeAspect="1"/>
-                    </pic:cNvPicPr>
-                  </pic:nvPicPr>
-                  <pic:blipFill>
-                    <a:blip r:embed="rId10"/>
-                    <a:stretch>
-                      <a:fillRect/>
-                    </a:stretch>
-                  </pic:blipFill>
-                  <pic:spPr>
-                    <a:xfrm>
-                      <a:off x="0" y="0"/>
-                      <a:ext cx="2999620" cy="2158765"/>
-                    </a:xfrm>
-                    <a:prstGeom prst="rect">
-                      <a:avLst/>
-                    </a:prstGeom>
-                  </pic:spPr>
-                </pic:pic>
-              </a:graphicData>
-            </a:graphic>
-          </wp:inline>
-        </w:drawing>
-      </w:r>
-    </w:p>
-    <w:p/>
-    <w:p/>
-    <w:p/>
-    <w:p/>
-    <w:p>
-      <w:r>
-        <w:lastRenderedPageBreak/>
-        <w:drawing>
-          <wp:inline distT="0" distB="0" distL="0" distR="0" wp14:anchorId="198DE3B3" wp14:editId="2D99E64D">
-            <wp:extent cx="3365500" cy="1548919"/>
-            <wp:effectExtent l="0" t="0" r="6350" b="0"/>
-            <wp:docPr id="2" name="Picture 1">
-              <a:extLst xmlns:a="http://schemas.openxmlformats.org/drawingml/2006/main">
-                <a:ext uri="{FF2B5EF4-FFF2-40B4-BE49-F238E27FC236}">
-                  <a16:creationId xmlns:a16="http://schemas.microsoft.com/office/drawing/2014/main" id="{224DE7E9-772C-43EA-A0EF-8E3959019348}"/>
-                </a:ext>
-              </a:extLst>
-            </wp:docPr>
-            <wp:cNvGraphicFramePr>
-              <a:graphicFrameLocks xmlns:a="http://schemas.openxmlformats.org/drawingml/2006/main" noChangeAspect="1"/>
-            </wp:cNvGraphicFramePr>
-            <a:graphic xmlns:a="http://schemas.openxmlformats.org/drawingml/2006/main">
-              <a:graphicData uri="http://schemas.openxmlformats.org/drawingml/2006/picture">
-                <pic:pic xmlns:pic="http://schemas.openxmlformats.org/drawingml/2006/picture">
-                  <pic:nvPicPr>
-                    <pic:cNvPr id="2" name="Picture 1">
-                      <a:extLst>
-                        <a:ext uri="{FF2B5EF4-FFF2-40B4-BE49-F238E27FC236}">
-                          <a16:creationId xmlns:a16="http://schemas.microsoft.com/office/drawing/2014/main" id="{224DE7E9-772C-43EA-A0EF-8E3959019348}"/>
-                        </a:ext>
-                      </a:extLst>
-                    </pic:cNvPr>
-                    <pic:cNvPicPr>
-                      <a:picLocks noChangeAspect="1"/>
-                    </pic:cNvPicPr>
-                  </pic:nvPicPr>
-                  <pic:blipFill>
-                    <a:blip r:embed="rId11"/>
-                    <a:stretch>
-                      <a:fillRect/>
-                    </a:stretch>
-                  </pic:blipFill>
-                  <pic:spPr>
-                    <a:xfrm>
-                      <a:off x="0" y="0"/>
-                      <a:ext cx="3376117" cy="1553805"/>
-                    </a:xfrm>
-                    <a:prstGeom prst="rect">
-                      <a:avLst/>
-                    </a:prstGeom>
-                  </pic:spPr>
-                </pic:pic>
-              </a:graphicData>
-            </a:graphic>
-          </wp:inline>
-        </w:drawing>
-      </w:r>
-      <w:r>
-        <w:drawing>
-          <wp:inline distT="0" distB="0" distL="0" distR="0" wp14:anchorId="78D01E8A" wp14:editId="76A8FE00">
-            <wp:extent cx="2838450" cy="1801650"/>
-            <wp:effectExtent l="0" t="0" r="0" b="8255"/>
-            <wp:docPr id="3" name="Picture 3">
-              <a:extLst xmlns:a="http://schemas.openxmlformats.org/drawingml/2006/main">
-                <a:ext uri="{FF2B5EF4-FFF2-40B4-BE49-F238E27FC236}">
-                  <a16:creationId xmlns:a16="http://schemas.microsoft.com/office/drawing/2014/main" id="{7919BF68-070A-433D-B45C-58F0312D32EC}"/>
-                </a:ext>
-              </a:extLst>
-            </wp:docPr>
-            <wp:cNvGraphicFramePr>
-              <a:graphicFrameLocks xmlns:a="http://schemas.openxmlformats.org/drawingml/2006/main" noChangeAspect="1"/>
-            </wp:cNvGraphicFramePr>
-            <a:graphic xmlns:a="http://schemas.openxmlformats.org/drawingml/2006/main">
-              <a:graphicData uri="http://schemas.openxmlformats.org/drawingml/2006/picture">
-                <pic:pic xmlns:pic="http://schemas.openxmlformats.org/drawingml/2006/picture">
-                  <pic:nvPicPr>
-                    <pic:cNvPr id="4" name="Picture 3">
-                      <a:extLst>
-                        <a:ext uri="{FF2B5EF4-FFF2-40B4-BE49-F238E27FC236}">
-                          <a16:creationId xmlns:a16="http://schemas.microsoft.com/office/drawing/2014/main" id="{7919BF68-070A-433D-B45C-58F0312D32EC}"/>
-                        </a:ext>
-                      </a:extLst>
-                    </pic:cNvPr>
-                    <pic:cNvPicPr>
-                      <a:picLocks noChangeAspect="1"/>
-                    </pic:cNvPicPr>
-                  </pic:nvPicPr>
-                  <pic:blipFill>
-                    <a:blip r:embed="rId12"/>
-                    <a:stretch>
-                      <a:fillRect/>
-                    </a:stretch>
-                  </pic:blipFill>
-                  <pic:spPr>
-                    <a:xfrm>
-                      <a:off x="0" y="0"/>
-                      <a:ext cx="2866838" cy="1819669"/>
-                    </a:xfrm>
-                    <a:prstGeom prst="rect">
-                      <a:avLst/>
-                    </a:prstGeom>
-                  </pic:spPr>
-                </pic:pic>
-              </a:graphicData>
-            </a:graphic>
-          </wp:inline>
-        </w:drawing>
-      </w:r>
-    </w:p>
-    <w:p>
-      <w:r>
-        <w:drawing>
-          <wp:inline distT="0" distB="0" distL="0" distR="0" wp14:anchorId="50164440" wp14:editId="7152E62A">
-            <wp:extent cx="2997200" cy="2933637"/>
-            <wp:effectExtent l="0" t="0" r="0" b="635"/>
-            <wp:docPr id="5" name="Picture 5">
-              <a:extLst xmlns:a="http://schemas.openxmlformats.org/drawingml/2006/main">
-                <a:ext uri="{FF2B5EF4-FFF2-40B4-BE49-F238E27FC236}">
-                  <a16:creationId xmlns:a16="http://schemas.microsoft.com/office/drawing/2014/main" id="{798B6525-D13F-4650-A576-39FC7A3A93BD}"/>
-                </a:ext>
-              </a:extLst>
-            </wp:docPr>
-            <wp:cNvGraphicFramePr>
-              <a:graphicFrameLocks xmlns:a="http://schemas.openxmlformats.org/drawingml/2006/main" noChangeAspect="1"/>
-            </wp:cNvGraphicFramePr>
-            <a:graphic xmlns:a="http://schemas.openxmlformats.org/drawingml/2006/main">
-              <a:graphicData uri="http://schemas.openxmlformats.org/drawingml/2006/picture">
-                <pic:pic xmlns:pic="http://schemas.openxmlformats.org/drawingml/2006/picture">
-                  <pic:nvPicPr>
-                    <pic:cNvPr id="6" name="Picture 5">
-                      <a:extLst>
-                        <a:ext uri="{FF2B5EF4-FFF2-40B4-BE49-F238E27FC236}">
-                          <a16:creationId xmlns:a16="http://schemas.microsoft.com/office/drawing/2014/main" id="{798B6525-D13F-4650-A576-39FC7A3A93BD}"/>
-                        </a:ext>
-                      </a:extLst>
-                    </pic:cNvPr>
-                    <pic:cNvPicPr>
-                      <a:picLocks noChangeAspect="1"/>
-                    </pic:cNvPicPr>
-                  </pic:nvPicPr>
-                  <pic:blipFill>
-                    <a:blip r:embed="rId13"/>
-                    <a:stretch>
-                      <a:fillRect/>
-                    </a:stretch>
-                  </pic:blipFill>
-                  <pic:spPr>
-                    <a:xfrm>
-                      <a:off x="0" y="0"/>
-                      <a:ext cx="3010452" cy="2946608"/>
-                    </a:xfrm>
-                    <a:prstGeom prst="rect">
-                      <a:avLst/>
-                    </a:prstGeom>
-                  </pic:spPr>
-                </pic:pic>
-              </a:graphicData>
-            </a:graphic>
-          </wp:inline>
-        </w:drawing>
-      </w:r>
-    </w:p>
-    <w:p>
-      <w:pPr>
-        <w:jc w:val="center"/>
-        <w:rPr>
-          <w:b/>
-          <w:bCs/>
-          <w:sz w:val="32"/>
-          <w:szCs w:val="32"/>
-          <w:u w:val="single"/>
-        </w:rPr>
-      </w:pPr>
-      <w:r>
-        <w:rPr>
-          <w:b/>
-          <w:bCs/>
-          <w:sz w:val="32"/>
-          <w:szCs w:val="32"/>
-          <w:u w:val="single"/>
-        </w:rPr>
-        <w:t xml:space="preserve">Benefits of using </w:t>
-      </w:r>
-      <w:r>
-        <w:rPr>
-          <w:b/>
-          <w:bCs/>
-          <w:sz w:val="32"/>
-          <w:szCs w:val="32"/>
-          <w:u w:val="single"/>
-        </w:rPr>
-        <w:t>of cockroach DB</w:t>
-      </w:r>
-    </w:p>
-    <w:p>
-      <w:pPr>
-        <w:rPr>
-          <w:sz w:val="24"/>
-          <w:szCs w:val="24"/>
-        </w:rPr>
-      </w:pPr>
-      <w:r>
-        <w:rPr>
-          <w:b/>
-          <w:bCs/>
-          <w:sz w:val="24"/>
-          <w:szCs w:val="24"/>
-        </w:rPr>
-        <w:t>What is Cockroach DB?</w:t>
-      </w:r>
-    </w:p>
-    <w:p>
-      <w:pPr>
-        <w:numPr>
-          <w:ilvl w:val="0"/>
-          <w:numId w:val="1"/>
-        </w:numPr>
-      </w:pPr>
-      <w:r>
-        <w:t xml:space="preserve">   </w:t>
-      </w:r>
-      <w:r>
-        <w:t xml:space="preserve">A distributed SQL database </w:t>
-      </w:r>
-    </w:p>
-    <w:p>
-      <w:pPr>
-        <w:numPr>
-          <w:ilvl w:val="0"/>
-          <w:numId w:val="2"/>
-        </w:numPr>
-      </w:pPr>
-      <w:r>
-        <w:t xml:space="preserve">   Designed for cloud applications </w:t>
-      </w:r>
-    </w:p>
-    <w:p>
-      <w:pPr>
-        <w:numPr>
-          <w:ilvl w:val="0"/>
-          <w:numId w:val="2"/>
-        </w:numPr>
-      </w:pPr>
-      <w:r>
-        <w:t xml:space="preserve">   Works like traditional SQL (PostgreSQL-style) but scales horizontally </w:t>
-      </w:r>
-    </w:p>
-    <w:p>
-      <w:pPr>
-        <w:rPr>
-          <w:sz w:val="24"/>
-          <w:szCs w:val="24"/>
-        </w:rPr>
-      </w:pPr>
-      <w:r>
-        <w:rPr>
-          <w:b/>
-          <w:bCs/>
-          <w:sz w:val="24"/>
-          <w:szCs w:val="24"/>
-        </w:rPr>
-        <w:t>Key Benefits</w:t>
-      </w:r>
-    </w:p>
-    <w:p>
-      <w:r>
-        <w:t>1. Horizontal Scalability</w:t>
-      </w:r>
-    </w:p>
-    <w:p>
-      <w:pPr>
-        <w:numPr>
-          <w:ilvl w:val="0"/>
-          <w:numId w:val="3"/>
-        </w:numPr>
-      </w:pPr>
-      <w:r>
-        <w:t xml:space="preserve"> Easily scale by adding more nodes </w:t>
-      </w:r>
-    </w:p>
-    <w:p>
-      <w:pPr>
-        <w:numPr>
-          <w:ilvl w:val="0"/>
-          <w:numId w:val="3"/>
-        </w:numPr>
-      </w:pPr>
-      <w:r>
-        <w:t xml:space="preserve"> No need to upgrade a single powerful server </w:t>
-      </w:r>
-    </w:p>
-    <w:p>
-      <w:pPr>
-        <w:numPr>
-          <w:ilvl w:val="0"/>
-          <w:numId w:val="3"/>
-        </w:numPr>
-      </w:pPr>
-      <w:r>
-        <w:t xml:space="preserve"> Handles large-scale systems smoothly</w:t>
-      </w:r>
-    </w:p>
-    <w:p>
-      <w:r>
-        <w:t>2. High Availability</w:t>
-      </w:r>
-    </w:p>
-    <w:p>
-      <w:pPr>
-        <w:numPr>
-          <w:ilvl w:val="0"/>
-          <w:numId w:val="4"/>
-        </w:numPr>
-      </w:pPr>
-      <w:r>
-        <w:t xml:space="preserve"> Data is automatically replicated across multiple nodes </w:t>
-      </w:r>
-    </w:p>
-    <w:p>
-      <w:pPr>
-        <w:numPr>
-          <w:ilvl w:val="0"/>
-          <w:numId w:val="4"/>
-        </w:numPr>
-      </w:pPr>
-      <w:r>
-        <w:t xml:space="preserve"> If one node fails, system keeps running </w:t>
-      </w:r>
-    </w:p>
-    <w:p>
-      <w:pPr>
-        <w:numPr>
-          <w:ilvl w:val="0"/>
-          <w:numId w:val="4"/>
-        </w:numPr>
-      </w:pPr>
-      <w:r>
-        <w:t xml:space="preserve"> Built-in fault tolerance</w:t>
-      </w:r>
-    </w:p>
-    <w:p>
-      <w:r>
-        <w:t>3. Distributed Architecture</w:t>
-      </w:r>
-    </w:p>
-    <w:p>
-      <w:pPr>
-        <w:numPr>
-          <w:ilvl w:val="0"/>
-          <w:numId w:val="5"/>
-        </w:numPr>
-      </w:pPr>
-      <w:r>
-        <w:t xml:space="preserve"> Data is spread across different machines/regions </w:t>
-      </w:r>
-    </w:p>
-    <w:p>
-      <w:pPr>
-        <w:numPr>
-          <w:ilvl w:val="0"/>
-          <w:numId w:val="5"/>
-        </w:numPr>
-      </w:pPr>
-      <w:r>
-        <w:t xml:space="preserve"> Enables global applications with low latency</w:t>
-      </w:r>
-    </w:p>
-    <w:p>
-      <w:r>
-        <w:lastRenderedPageBreak/>
-        <w:t>4. Fault Tolerance &amp; Self-Healing</w:t>
-      </w:r>
-    </w:p>
-    <w:p>
-      <w:pPr>
-        <w:numPr>
-          <w:ilvl w:val="0"/>
-          <w:numId w:val="6"/>
-        </w:numPr>
-      </w:pPr>
-      <w:r>
-        <w:t xml:space="preserve"> Automatically recovers from failures </w:t>
-      </w:r>
-    </w:p>
-    <w:p>
-      <w:pPr>
-        <w:numPr>
-          <w:ilvl w:val="0"/>
-          <w:numId w:val="6"/>
-        </w:numPr>
-      </w:pPr>
-      <w:r>
-        <w:t xml:space="preserve"> Rebalances data without manual intervention</w:t>
-      </w:r>
-    </w:p>
-    <w:p>
-      <w:r>
-        <w:t>5. SQL Support (Easy to Learn)</w:t>
-      </w:r>
-    </w:p>
-    <w:p>
-      <w:pPr>
-        <w:numPr>
-          <w:ilvl w:val="0"/>
-          <w:numId w:val="7"/>
-        </w:numPr>
-      </w:pPr>
-      <w:r>
-        <w:t xml:space="preserve"> Uses familiar SQL (similar to PostgreSQL) </w:t>
-      </w:r>
-    </w:p>
-    <w:p>
-      <w:pPr>
-        <w:numPr>
-          <w:ilvl w:val="0"/>
-          <w:numId w:val="7"/>
-        </w:numPr>
-      </w:pPr>
-      <w:r>
-        <w:t xml:space="preserve"> Easy for developers to adopt</w:t>
-      </w:r>
-    </w:p>
-    <w:p>
-      <w:r>
-        <w:t>6. Geo-Distribution</w:t>
-      </w:r>
-    </w:p>
-    <w:p>
-      <w:pPr>
-        <w:numPr>
-          <w:ilvl w:val="0"/>
-          <w:numId w:val="8"/>
-        </w:numPr>
-      </w:pPr>
-      <w:r>
-        <w:t xml:space="preserve"> Store data closer to users worldwide </w:t>
-      </w:r>
-    </w:p>
-    <w:p>
-      <w:pPr>
-        <w:numPr>
-          <w:ilvl w:val="0"/>
-          <w:numId w:val="8"/>
-        </w:numPr>
-      </w:pPr>
-      <w:r>
-        <w:t xml:space="preserve"> Improves performance and user experience</w:t>
-      </w:r>
-    </w:p>
-    <w:p>
-      <w:pPr>
-        <w:jc w:val="center"/>
-        <w:rPr>
-          <w:sz w:val="32"/>
-          <w:szCs w:val="32"/>
-          <w:u w:val="single"/>
-        </w:rPr>
-      </w:pPr>
-      <w:r>
-        <w:rPr>
-          <w:b/>
-          <w:bCs/>
-          <w:sz w:val="32"/>
-          <w:szCs w:val="32"/>
-          <w:u w:val="single"/>
-        </w:rPr>
-        <w:t>Partitioning Diagram</w:t>
-      </w:r>
-    </w:p>
-    <w:p>
-      <w:pPr>
-        <w:pStyle w:val="ListParagraph"/>
-        <w:numPr>
-          <w:ilvl w:val="0"/>
-          <w:numId w:val="9"/>
-        </w:numPr>
-      </w:pPr>
-      <w:r>
-        <w:t>Each table may be split into many ranges of rows each of 64MB or less according to traffic load</w:t>
-      </w:r>
-    </w:p>
-    <w:p>
-      <w:pPr>
-        <w:pStyle w:val="ListParagraph"/>
-        <w:numPr>
-          <w:ilvl w:val="0"/>
-          <w:numId w:val="9"/>
-        </w:numPr>
-      </w:pPr>
-      <w:r>
-        <w:t>Each range is replicated in the 3 nodes</w:t>
-      </w:r>
-    </w:p>
-    <w:p>
-      <w:pPr>
-        <w:pStyle w:val="ListParagraph"/>
-        <w:numPr>
-          <w:ilvl w:val="0"/>
-          <w:numId w:val="9"/>
-        </w:numPr>
-      </w:pPr>
-      <w:r>
-        <w:t>Automatically number of ranges (Chunks) are dynamically managed by cockroach DB itself according to traffic load or failed Nodes</w:t>
-      </w:r>
-    </w:p>
-    <w:p>
-      <w:pPr>
-        <w:pStyle w:val="ListParagraph"/>
-        <w:numPr>
-          <w:ilvl w:val="0"/>
-          <w:numId w:val="9"/>
-        </w:numPr>
-      </w:pPr>
-      <w:r>
-        <w:t>Horizontal partitioning</w:t>
-      </w:r>
-    </w:p>
-    <w:p>
-      <w:pPr>
-        <w:pStyle w:val="ListParagraph"/>
-        <w:numPr>
-          <w:ilvl w:val="0"/>
-          <w:numId w:val="9"/>
-        </w:numPr>
-      </w:pPr>
-      <w:r>
-        <w:t>Shard key is the primary key of each table so that avoid hot nodes to balance the traffic</w:t>
-      </w:r>
-    </w:p>
-    <w:p>
-      <w:r>
-        <w:drawing>
-          <wp:inline distT="0" distB="0" distL="0" distR="0" wp14:anchorId="2B9BD268" wp14:editId="1AF7A8DC">
+          <wp:inline distT="0" distB="0" distL="0" distR="0" wp14:anchorId="570E80EF" wp14:editId="19363DB2">
             <wp:extent cx="6102350" cy="1744623"/>
-            <wp:effectExtent l="0" t="0" r="0" b="8255"/>
+            <wp:effectExtent l="152400" t="152400" r="355600" b="370205"/>
             <wp:docPr id="7" name="Picture 6">
               <a:extLst xmlns:a="http://schemas.openxmlformats.org/drawingml/2006/main">
                 <a:ext uri="{FF2B5EF4-FFF2-40B4-BE49-F238E27FC236}">
@@ -879,7 +418,7 @@
                     </pic:cNvPicPr>
                   </pic:nvPicPr>
                   <pic:blipFill>
-                    <a:blip r:embed="rId14"/>
+                    <a:blip r:embed="rId7"/>
                     <a:stretch>
                       <a:fillRect/>
                     </a:stretch>
@@ -892,6 +431,16 @@
                     <a:prstGeom prst="rect">
                       <a:avLst/>
                     </a:prstGeom>
+                    <a:ln>
+                      <a:noFill/>
+                    </a:ln>
+                    <a:effectLst>
+                      <a:outerShdw blurRad="292100" dist="139700" dir="2700000" algn="tl" rotWithShape="0">
+                        <a:srgbClr val="333333">
+                          <a:alpha val="65000"/>
+                        </a:srgbClr>
+                      </a:outerShdw>
+                    </a:effectLst>
                   </pic:spPr>
                 </pic:pic>
               </a:graphicData>
@@ -901,11 +450,17 @@
       </w:r>
     </w:p>
     <w:p>
-      <w:r>
+      <w:pPr>
+        <w:jc w:val="center"/>
+      </w:pPr>
+      <w:r>
+        <w:rPr>
+          <w:noProof/>
+        </w:rPr>
         <w:drawing>
-          <wp:inline distT="0" distB="0" distL="0" distR="0" wp14:anchorId="4C0C5D64" wp14:editId="16A1E847">
+          <wp:inline distT="0" distB="0" distL="0" distR="0" wp14:anchorId="48003EBE" wp14:editId="2E834A9C">
             <wp:extent cx="6330950" cy="521752"/>
-            <wp:effectExtent l="0" t="0" r="0" b="0"/>
+            <wp:effectExtent l="152400" t="152400" r="355600" b="354965"/>
             <wp:docPr id="16" name="Picture 4">
               <a:extLst xmlns:a="http://schemas.openxmlformats.org/drawingml/2006/main">
                 <a:ext uri="{FF2B5EF4-FFF2-40B4-BE49-F238E27FC236}">
@@ -932,7 +487,7 @@
                     </pic:cNvPicPr>
                   </pic:nvPicPr>
                   <pic:blipFill>
-                    <a:blip r:embed="rId15"/>
+                    <a:blip r:embed="rId8"/>
                     <a:stretch>
                       <a:fillRect/>
                     </a:stretch>
@@ -945,6 +500,16 @@
                     <a:prstGeom prst="rect">
                       <a:avLst/>
                     </a:prstGeom>
+                    <a:ln>
+                      <a:noFill/>
+                    </a:ln>
+                    <a:effectLst>
+                      <a:outerShdw blurRad="292100" dist="139700" dir="2700000" algn="tl" rotWithShape="0">
+                        <a:srgbClr val="333333">
+                          <a:alpha val="65000"/>
+                        </a:srgbClr>
+                      </a:outerShdw>
+                    </a:effectLst>
                   </pic:spPr>
                 </pic:pic>
               </a:graphicData>
@@ -953,126 +518,105 @@
         </w:drawing>
       </w:r>
     </w:p>
-    <w:p/>
-    <w:p>
-      <w:pPr>
-        <w:jc w:val="center"/>
-        <w:rPr>
-          <w:b/>
-          <w:bCs/>
-          <w:sz w:val="32"/>
-          <w:szCs w:val="32"/>
-        </w:rPr>
-      </w:pPr>
-    </w:p>
-    <w:p>
-      <w:pPr>
-        <w:jc w:val="center"/>
-        <w:rPr>
-          <w:b/>
-          <w:bCs/>
-          <w:sz w:val="32"/>
-          <w:szCs w:val="32"/>
-        </w:rPr>
-      </w:pPr>
-    </w:p>
-    <w:p>
-      <w:pPr>
-        <w:jc w:val="center"/>
-        <w:rPr>
-          <w:b/>
-          <w:bCs/>
-          <w:sz w:val="32"/>
-          <w:szCs w:val="32"/>
-        </w:rPr>
-      </w:pPr>
-    </w:p>
-    <w:p>
-      <w:pPr>
-        <w:jc w:val="center"/>
-        <w:rPr>
-          <w:b/>
-          <w:bCs/>
-          <w:sz w:val="32"/>
-          <w:szCs w:val="32"/>
-        </w:rPr>
-      </w:pPr>
-    </w:p>
-    <w:p>
-      <w:pPr>
-        <w:jc w:val="center"/>
-        <w:rPr>
-          <w:b/>
-          <w:bCs/>
-          <w:sz w:val="32"/>
-          <w:szCs w:val="32"/>
-        </w:rPr>
-      </w:pPr>
-    </w:p>
-    <w:p>
-      <w:pPr>
-        <w:jc w:val="center"/>
-        <w:rPr>
-          <w:b/>
-          <w:bCs/>
-          <w:sz w:val="32"/>
-          <w:szCs w:val="32"/>
-        </w:rPr>
-      </w:pPr>
-    </w:p>
-    <w:p>
-      <w:pPr>
-        <w:jc w:val="center"/>
-        <w:rPr>
-          <w:b/>
-          <w:bCs/>
-          <w:sz w:val="32"/>
-          <w:szCs w:val="32"/>
-        </w:rPr>
-      </w:pPr>
-    </w:p>
-    <w:p>
-      <w:pPr>
-        <w:jc w:val="center"/>
-        <w:rPr>
-          <w:b/>
-          <w:bCs/>
-          <w:sz w:val="32"/>
-          <w:szCs w:val="32"/>
-        </w:rPr>
-      </w:pPr>
-    </w:p>
-    <w:p>
-      <w:pPr>
-        <w:jc w:val="center"/>
-        <w:rPr>
-          <w:b/>
-          <w:bCs/>
-          <w:sz w:val="32"/>
-          <w:szCs w:val="32"/>
-        </w:rPr>
-      </w:pPr>
-    </w:p>
-    <w:p>
-      <w:pPr>
-        <w:jc w:val="center"/>
-        <w:rPr>
-          <w:b/>
-          <w:bCs/>
-          <w:sz w:val="32"/>
-          <w:szCs w:val="32"/>
-          <w:u w:val="single"/>
-        </w:rPr>
-      </w:pPr>
-      <w:r>
-        <w:rPr>
-          <w:b/>
-          <w:bCs/>
-          <w:sz w:val="32"/>
-          <w:szCs w:val="32"/>
-          <w:u w:val="single"/>
-        </w:rPr>
-        <w:t>Database system architecture</w:t>
+    <w:p>
+      <w:pPr>
+        <w:pStyle w:val="ListParagraph"/>
+        <w:numPr>
+          <w:ilvl w:val="0"/>
+          <w:numId w:val="9"/>
+        </w:numPr>
+      </w:pPr>
+      <w:r>
+        <w:t>Each table may be split into many ranges of rows each of 64MB or less according to traffic load</w:t>
+      </w:r>
+      <w:r>
+        <w:t>.</w:t>
+      </w:r>
+    </w:p>
+    <w:p>
+      <w:pPr>
+        <w:pStyle w:val="ListParagraph"/>
+        <w:numPr>
+          <w:ilvl w:val="0"/>
+          <w:numId w:val="9"/>
+        </w:numPr>
+      </w:pPr>
+      <w:r>
+        <w:t>Each range is replicated in the 3 nodes</w:t>
+      </w:r>
+      <w:r>
+        <w:t>.</w:t>
+      </w:r>
+    </w:p>
+    <w:p>
+      <w:pPr>
+        <w:pStyle w:val="ListParagraph"/>
+        <w:numPr>
+          <w:ilvl w:val="0"/>
+          <w:numId w:val="9"/>
+        </w:numPr>
+      </w:pPr>
+      <w:r>
+        <w:t xml:space="preserve">Automatically number of ranges (Chunks) are dynamically managed by cockroach DB itself according to traffic load or failed </w:t>
+      </w:r>
+      <w:r>
+        <w:t>n</w:t>
+      </w:r>
+      <w:r>
+        <w:t>odes</w:t>
+      </w:r>
+      <w:r>
+        <w:t>.</w:t>
+      </w:r>
+    </w:p>
+    <w:p>
+      <w:pPr>
+        <w:pStyle w:val="ListParagraph"/>
+        <w:numPr>
+          <w:ilvl w:val="0"/>
+          <w:numId w:val="9"/>
+        </w:numPr>
+      </w:pPr>
+      <w:r>
+        <w:t>Horizontal partitioning</w:t>
+      </w:r>
+    </w:p>
+    <w:p>
+      <w:pPr>
+        <w:pStyle w:val="ListParagraph"/>
+        <w:numPr>
+          <w:ilvl w:val="0"/>
+          <w:numId w:val="9"/>
+        </w:numPr>
+      </w:pPr>
+      <w:r>
+        <w:t>Shard key is the primary key of each table so that avoid hot nodes to balance the traffic</w:t>
+      </w:r>
+      <w:r>
+        <w:t>.</w:t>
+      </w:r>
+    </w:p>
+    <w:p>
+      <w:r>
+        <w:br w:type="page"/>
+      </w:r>
+    </w:p>
+    <w:p>
+      <w:pPr>
+        <w:pStyle w:val="Heading2"/>
+      </w:pPr>
+      <w:r>
+        <w:lastRenderedPageBreak/>
+        <w:t xml:space="preserve">Database </w:t>
+      </w:r>
+      <w:r>
+        <w:t>A</w:t>
+      </w:r>
+      <w:r>
+        <w:t>rchitecture</w:t>
+      </w:r>
+      <w:r>
+        <w:t xml:space="preserve"> Diagram</w:t>
       </w:r>
     </w:p>
     <w:p>
@@ -1091,9 +635,9 @@
           <w:noProof/>
         </w:rPr>
         <w:drawing>
-          <wp:inline distT="0" distB="0" distL="0" distR="0" wp14:anchorId="09647BEB" wp14:editId="1471B269">
+          <wp:inline distT="0" distB="0" distL="0" distR="0" wp14:anchorId="09647BEB" wp14:editId="2BC0F257">
             <wp:extent cx="5956300" cy="3970867"/>
-            <wp:effectExtent l="0" t="0" r="6350" b="0"/>
+            <wp:effectExtent l="152400" t="152400" r="368300" b="353695"/>
             <wp:docPr id="18" name="Picture 18"/>
             <wp:cNvGraphicFramePr>
               <a:graphicFrameLocks xmlns:a="http://schemas.openxmlformats.org/drawingml/2006/main" noChangeAspect="1"/>
@@ -1108,7 +652,7 @@
                     </pic:cNvPicPr>
                   </pic:nvPicPr>
                   <pic:blipFill>
-                    <a:blip r:embed="rId16" cstate="print">
+                    <a:blip r:embed="rId9" cstate="print">
                       <a:extLst>
                         <a:ext uri="{28A0092B-C50C-407E-A947-70E740481C1C}">
                           <a14:useLocalDpi xmlns:a14="http://schemas.microsoft.com/office/drawing/2010/main" val="0"/>
@@ -1128,10 +672,16 @@
                     <a:prstGeom prst="rect">
                       <a:avLst/>
                     </a:prstGeom>
-                    <a:noFill/>
                     <a:ln>
                       <a:noFill/>
                     </a:ln>
+                    <a:effectLst>
+                      <a:outerShdw blurRad="292100" dist="139700" dir="2700000" algn="tl" rotWithShape="0">
+                        <a:srgbClr val="333333">
+                          <a:alpha val="65000"/>
+                        </a:srgbClr>
+                      </a:outerShdw>
+                    </a:effectLst>
                   </pic:spPr>
                 </pic:pic>
               </a:graphicData>
@@ -1159,6 +709,13 @@
         </w:rPr>
         <w:t>KV is shortcut for key value indices storage for fast search</w:t>
       </w:r>
+      <w:r>
+        <w:rPr>
+          <w:sz w:val="28"/>
+          <w:szCs w:val="28"/>
+        </w:rPr>
+        <w:t>.</w:t>
+      </w:r>
     </w:p>
     <w:p>
       <w:pPr>
@@ -1192,6 +749,13 @@
           <w:szCs w:val="28"/>
         </w:rPr>
         <w:t>in which the two nodes must agree for the update or insertion for successful query</w:t>
+      </w:r>
+      <w:r>
+        <w:rPr>
+          <w:sz w:val="28"/>
+          <w:szCs w:val="28"/>
+        </w:rPr>
+        <w:t>.</w:t>
       </w:r>
     </w:p>
     <w:sectPr>
@@ -1205,7 +769,7 @@
 </file>
 
 <file path=word/numbering.xml><?xml version="1.0" encoding="utf-8"?>
-<w:numbering xmlns:wpc="http://schemas.microsoft.com/office/word/2010/wordprocessingCanvas" xmlns:cx="http://schemas.microsoft.com/office/drawing/2014/chartex" xmlns:cx1="http://schemas.microsoft.com/office/drawing/2015/9/8/chartex" xmlns:cx2="http://schemas.microsoft.com/office/drawing/2015/10/21/chartex" xmlns:cx3="http://schemas.microsoft.com/office/drawing/2016/5/9/chartex" xmlns:cx4="http://schemas.microsoft.com/office/drawing/2016/5/10/chartex" xmlns:cx5="http://schemas.microsoft.com/office/drawing/2016/5/11/chartex" xmlns:cx6="http://schemas.microsoft.com/office/drawing/2016/5/12/chartex" xmlns:cx7="http://schemas.microsoft.com/office/drawing/2016/5/13/chartex" xmlns:cx8="http://schemas.microsoft.com/office/drawing/2016/5/14/chartex" xmlns:mc="http://schemas.openxmlformats.org/markup-compatibility/2006" xmlns:aink="http://schemas.microsoft.com/office/drawing/2016/ink" xmlns:am3d="http://schemas.microsoft.com/office/drawing/2017/model3d" xmlns:o="urn:schemas-microsoft-com:office:office" xmlns:r="http://schemas.openxmlformats.org/officeDocument/2006/relationships" xmlns:m="http://schemas.openxmlformats.org/officeDocument/2006/math" xmlns:v="urn:schemas-microsoft-com:vml" xmlns:wp14="http://schemas.microsoft.com/office/word/2010/wordprocessingDrawing" xmlns:wp="http://schemas.openxmlformats.org/drawingml/2006/wordprocessingDrawing" xmlns:w10="urn:schemas-microsoft-com:office:word" xmlns:w="http://schemas.openxmlformats.org/wordprocessingml/2006/main" xmlns:w14="http://schemas.microsoft.com/office/word/2010/wordml" xmlns:w15="http://schemas.microsoft.com/office/word/2012/wordml" xmlns:w16cex="http://schemas.microsoft.com/office/word/2018/wordml/cex" xmlns:w16cid="http://schemas.microsoft.com/office/word/2016/wordml/cid" xmlns:w16="http://schemas.microsoft.com/office/word/2018/wordml" xmlns:w16sdtdh="http://schemas.microsoft.com/office/word/2020/wordml/sdtdatahash" xmlns:w16se="http://schemas.microsoft.com/office/word/2015/wordml/symex" xmlns:wpg="http://schemas.microsoft.com/office/word/2010/wordprocessingGroup" xmlns:wpi="http://schemas.microsoft.com/office/word/2010/wordprocessingInk" xmlns:wne="http://schemas.microsoft.com/office/word/2006/wordml" xmlns:wps="http://schemas.microsoft.com/office/word/2010/wordprocessingShape" mc:Ignorable="w14 w15 w16se w16cid w16 w16cex w16sdtdh wp14">
+<w:numbering xmlns:wpc="http://schemas.microsoft.com/office/word/2010/wordprocessingCanvas" xmlns:cx="http://schemas.microsoft.com/office/drawing/2014/chartex" xmlns:cx1="http://schemas.microsoft.com/office/drawing/2015/9/8/chartex" xmlns:cx2="http://schemas.microsoft.com/office/drawing/2015/10/21/chartex" xmlns:cx3="http://schemas.microsoft.com/office/drawing/2016/5/9/chartex" xmlns:cx4="http://schemas.microsoft.com/office/drawing/2016/5/10/chartex" xmlns:cx5="http://schemas.microsoft.com/office/drawing/2016/5/11/chartex" xmlns:cx6="http://schemas.microsoft.com/office/drawing/2016/5/12/chartex" xmlns:cx7="http://schemas.microsoft.com/office/drawing/2016/5/13/chartex" xmlns:cx8="http://schemas.microsoft.com/office/drawing/2016/5/14/chartex" xmlns:mc="http://schemas.openxmlformats.org/markup-compatibility/2006" xmlns:aink="http://schemas.microsoft.com/office/drawing/2016/ink" xmlns:am3d="http://schemas.microsoft.com/office/drawing/2017/model3d" xmlns:o="urn:schemas-microsoft-com:office:office" xmlns:oel="http://schemas.microsoft.com/office/2019/extlst" xmlns:r="http://schemas.openxmlformats.org/officeDocument/2006/relationships" xmlns:m="http://schemas.openxmlformats.org/officeDocument/2006/math" xmlns:v="urn:schemas-microsoft-com:vml" xmlns:wp14="http://schemas.microsoft.com/office/word/2010/wordprocessingDrawing" xmlns:wp="http://schemas.openxmlformats.org/drawingml/2006/wordprocessingDrawing" xmlns:w10="urn:schemas-microsoft-com:office:word" xmlns:w="http://schemas.openxmlformats.org/wordprocessingml/2006/main" xmlns:w14="http://schemas.microsoft.com/office/word/2010/wordml" xmlns:w15="http://schemas.microsoft.com/office/word/2012/wordml" xmlns:w16cex="http://schemas.microsoft.com/office/word/2018/wordml/cex" xmlns:w16cid="http://schemas.microsoft.com/office/word/2016/wordml/cid" xmlns:w16="http://schemas.microsoft.com/office/word/2018/wordml" xmlns:w16du="http://schemas.microsoft.com/office/word/2023/wordml/word16du" xmlns:w16sdtdh="http://schemas.microsoft.com/office/word/2020/wordml/sdtdatahash" xmlns:w16se="http://schemas.microsoft.com/office/word/2015/wordml/symex" xmlns:wpg="http://schemas.microsoft.com/office/word/2010/wordprocessingGroup" xmlns:wpi="http://schemas.microsoft.com/office/word/2010/wordprocessingInk" xmlns:wne="http://schemas.microsoft.com/office/word/2006/wordml" xmlns:wps="http://schemas.microsoft.com/office/word/2010/wordprocessingShape" mc:Ignorable="w14 w15 w16se w16cid w16 w16cex w16sdtdh wp14">
   <w:abstractNum w:abstractNumId="0" w15:restartNumberingAfterBreak="0">
     <w:nsid w:val="00125E27"/>
     <w:multiLevelType w:val="hybridMultilevel"/>
@@ -2552,34 +2116,34 @@
       </w:rPr>
     </w:lvl>
   </w:abstractNum>
-  <w:num w:numId="1">
+  <w:num w:numId="1" w16cid:durableId="1573196561">
     <w:abstractNumId w:val="8"/>
   </w:num>
-  <w:num w:numId="2">
+  <w:num w:numId="2" w16cid:durableId="1496989003">
     <w:abstractNumId w:val="3"/>
   </w:num>
-  <w:num w:numId="3">
+  <w:num w:numId="3" w16cid:durableId="1764884899">
     <w:abstractNumId w:val="1"/>
   </w:num>
-  <w:num w:numId="4">
+  <w:num w:numId="4" w16cid:durableId="1664358003">
     <w:abstractNumId w:val="4"/>
   </w:num>
-  <w:num w:numId="5">
+  <w:num w:numId="5" w16cid:durableId="1922906062">
     <w:abstractNumId w:val="5"/>
   </w:num>
-  <w:num w:numId="6">
+  <w:num w:numId="6" w16cid:durableId="283775212">
     <w:abstractNumId w:val="2"/>
   </w:num>
-  <w:num w:numId="7">
+  <w:num w:numId="7" w16cid:durableId="930430432">
     <w:abstractNumId w:val="7"/>
   </w:num>
-  <w:num w:numId="8">
+  <w:num w:numId="8" w16cid:durableId="79178542">
     <w:abstractNumId w:val="6"/>
   </w:num>
-  <w:num w:numId="9">
+  <w:num w:numId="9" w16cid:durableId="1054430301">
     <w:abstractNumId w:val="9"/>
   </w:num>
-  <w:num w:numId="10">
+  <w:num w:numId="10" w16cid:durableId="1531338657">
     <w:abstractNumId w:val="0"/>
   </w:num>
 </w:numbering>
@@ -2984,9 +2548,53 @@
     <w:name w:val="Normal"/>
     <w:qFormat/>
   </w:style>
+  <w:style w:type="paragraph" w:styleId="Heading1">
+    <w:name w:val="heading 1"/>
+    <w:basedOn w:val="Normal"/>
+    <w:next w:val="Normal"/>
+    <w:link w:val="Heading1Char"/>
+    <w:uiPriority w:val="9"/>
+    <w:qFormat/>
+    <w:rsid w:val="00144C0E"/>
+    <w:pPr>
+      <w:keepNext/>
+      <w:keepLines/>
+      <w:spacing w:before="240" w:after="0"/>
+      <w:outlineLvl w:val="0"/>
+    </w:pPr>
+    <w:rPr>
+      <w:rFonts w:asciiTheme="majorHAnsi" w:eastAsiaTheme="majorEastAsia" w:hAnsiTheme="majorHAnsi" w:cstheme="majorBidi"/>
+      <w:color w:val="2F5496" w:themeColor="accent1" w:themeShade="BF"/>
+      <w:sz w:val="32"/>
+      <w:szCs w:val="32"/>
+    </w:rPr>
+  </w:style>
+  <w:style w:type="paragraph" w:styleId="Heading2">
+    <w:name w:val="heading 2"/>
+    <w:basedOn w:val="Normal"/>
+    <w:next w:val="Normal"/>
+    <w:link w:val="Heading2Char"/>
+    <w:uiPriority w:val="9"/>
+    <w:unhideWhenUsed/>
+    <w:qFormat/>
+    <w:rsid w:val="00144C0E"/>
+    <w:pPr>
+      <w:keepNext/>
+      <w:keepLines/>
+      <w:spacing w:before="40" w:after="0"/>
+      <w:outlineLvl w:val="1"/>
+    </w:pPr>
+    <w:rPr>
+      <w:rFonts w:asciiTheme="majorHAnsi" w:eastAsiaTheme="majorEastAsia" w:hAnsiTheme="majorHAnsi" w:cstheme="majorBidi"/>
+      <w:color w:val="2F5496" w:themeColor="accent1" w:themeShade="BF"/>
+      <w:sz w:val="26"/>
+      <w:szCs w:val="26"/>
+    </w:rPr>
+  </w:style>
   <w:style w:type="character" w:default="1" w:styleId="DefaultParagraphFont">
     <w:name w:val="Default Paragraph Font"/>
     <w:uiPriority w:val="1"/>
+    <w:semiHidden/>
     <w:unhideWhenUsed/>
   </w:style>
   <w:style w:type="table" w:default="1" w:styleId="TableNormal">
@@ -3036,6 +2644,32 @@
       <w:ind w:left="720"/>
       <w:contextualSpacing/>
     </w:pPr>
+  </w:style>
+  <w:style w:type="character" w:customStyle="1" w:styleId="Heading1Char">
+    <w:name w:val="Heading 1 Char"/>
+    <w:basedOn w:val="DefaultParagraphFont"/>
+    <w:link w:val="Heading1"/>
+    <w:uiPriority w:val="9"/>
+    <w:rsid w:val="00144C0E"/>
+    <w:rPr>
+      <w:rFonts w:asciiTheme="majorHAnsi" w:eastAsiaTheme="majorEastAsia" w:hAnsiTheme="majorHAnsi" w:cstheme="majorBidi"/>
+      <w:color w:val="2F5496" w:themeColor="accent1" w:themeShade="BF"/>
+      <w:sz w:val="32"/>
+      <w:szCs w:val="32"/>
+    </w:rPr>
+  </w:style>
+  <w:style w:type="character" w:customStyle="1" w:styleId="Heading2Char">
+    <w:name w:val="Heading 2 Char"/>
+    <w:basedOn w:val="DefaultParagraphFont"/>
+    <w:link w:val="Heading2"/>
+    <w:uiPriority w:val="9"/>
+    <w:rsid w:val="00144C0E"/>
+    <w:rPr>
+      <w:rFonts w:asciiTheme="majorHAnsi" w:eastAsiaTheme="majorEastAsia" w:hAnsiTheme="majorHAnsi" w:cstheme="majorBidi"/>
+      <w:color w:val="2F5496" w:themeColor="accent1" w:themeShade="BF"/>
+      <w:sz w:val="26"/>
+      <w:szCs w:val="26"/>
+    </w:rPr>
   </w:style>
 </w:styles>
 </file>

</xml_diff>